<commit_message>
História do CLiente - Corrigida
História do Cliente Corrigida referente à primeira atividade de Banco de Dados
</commit_message>
<xml_diff>
--- a/Atividade BD - História do Cliente (Steam).docx
+++ b/Atividade BD - História do Cliente (Steam).docx
@@ -46,6 +46,28 @@
         <w:rPr>
           <w:rFonts w:ascii="Arial" w:hAnsi="Arial" w:cs="Arial"/>
           <w:b/>
+          <w:color w:val="FF0000"/>
+          <w:sz w:val="28"/>
+          <w:szCs w:val="40"/>
+        </w:rPr>
+      </w:pPr>
+      <w:r>
+        <w:rPr>
+          <w:rFonts w:ascii="Arial" w:hAnsi="Arial" w:cs="Arial"/>
+          <w:b/>
+          <w:color w:val="FF0000"/>
+          <w:sz w:val="28"/>
+          <w:szCs w:val="40"/>
+        </w:rPr>
+        <w:t>(1ª Versão)</w:t>
+      </w:r>
+    </w:p>
+    <w:p>
+      <w:pPr>
+        <w:jc w:val="center"/>
+        <w:rPr>
+          <w:rFonts w:ascii="Arial" w:hAnsi="Arial" w:cs="Arial"/>
+          <w:b/>
           <w:color w:val="002060"/>
           <w:sz w:val="34"/>
           <w:szCs w:val="34"/>
@@ -72,6 +94,8 @@
         </w:rPr>
         <w:t>Steam</w:t>
       </w:r>
+      <w:bookmarkStart w:id="0" w:name="_GoBack"/>
+      <w:bookmarkEnd w:id="0"/>
       <w:proofErr w:type="spellEnd"/>
     </w:p>
     <w:p>
@@ -381,16 +405,8 @@
           <w:sz w:val="24"/>
           <w:szCs w:val="24"/>
         </w:rPr>
-        <w:t xml:space="preserve">A plataforma foi desenvolvida com foco em simplicidade e eficiência. A interface compacta e intuitiva permite navegação fluida, busca otimizada e descoberta de jogos de forma natural. A leveza do software garante que, </w:t>
-      </w:r>
-      <w:r>
-        <w:rPr>
-          <w:rFonts w:ascii="Arial" w:hAnsi="Arial" w:cs="Arial"/>
-          <w:sz w:val="24"/>
-          <w:szCs w:val="24"/>
-        </w:rPr>
         <w:lastRenderedPageBreak/>
-        <w:t>mesmo com milhares de títulos disponíveis, o desempenho permaneça consistente em diferentes dispositivos e conexões.</w:t>
+        <w:t>A plataforma foi desenvolvida com foco em simplicidade e eficiência. A interface compacta e intuitiva permite navegação fluida, busca otimizada e descoberta de jogos de forma natural. A leveza do software garante que, mesmo com milhares de títulos disponíveis, o desempenho permaneça consistente em diferentes dispositivos e conexões.</w:t>
       </w:r>
     </w:p>
     <w:p>
@@ -538,8 +554,6 @@
           <w:szCs w:val="24"/>
         </w:rPr>
       </w:pPr>
-      <w:bookmarkStart w:id="0" w:name="_GoBack"/>
-      <w:bookmarkEnd w:id="0"/>
     </w:p>
     <w:p>
       <w:pPr>
@@ -766,6 +780,7 @@
           <w:sz w:val="24"/>
           <w:szCs w:val="24"/>
         </w:rPr>
+        <w:lastRenderedPageBreak/>
         <w:t>Gestão autônoma:</w:t>
       </w:r>
       <w:r>
@@ -800,7 +815,6 @@
           <w:sz w:val="36"/>
           <w:szCs w:val="36"/>
         </w:rPr>
-        <w:lastRenderedPageBreak/>
         <w:t>Modelo de Sustentabilidade e Parceria</w:t>
       </w:r>
     </w:p>
@@ -858,15 +872,7 @@
           <w:sz w:val="24"/>
           <w:szCs w:val="24"/>
         </w:rPr>
-        <w:t xml:space="preserve"> A plataforma retém 15% do faturamento bruto de cada jogo comercializado</w:t>
-      </w:r>
-      <w:r>
-        <w:rPr>
-          <w:rFonts w:ascii="Arial" w:hAnsi="Arial" w:cs="Arial"/>
-          <w:sz w:val="24"/>
-          <w:szCs w:val="24"/>
-        </w:rPr>
-        <w:t>.</w:t>
+        <w:t xml:space="preserve"> A plataforma retém 15% do faturamento bruto de cada jogo comercializado.</w:t>
       </w:r>
     </w:p>
     <w:p>
@@ -1303,6 +1309,7 @@
           <w:sz w:val="24"/>
           <w:szCs w:val="24"/>
         </w:rPr>
+        <w:lastRenderedPageBreak/>
         <w:t xml:space="preserve">  </w:t>
       </w:r>
       <w:r>
@@ -1382,15 +1389,6 @@
           <w:szCs w:val="28"/>
         </w:rPr>
         <w:t>foi a mediante do processo.</w:t>
-      </w:r>
-      <w:r>
-        <w:rPr>
-          <w:rFonts w:ascii="Arial" w:hAnsi="Arial" w:cs="Arial"/>
-          <w:color w:val="FF0000"/>
-          <w:sz w:val="28"/>
-          <w:szCs w:val="28"/>
-        </w:rPr>
-        <w:t>0</w:t>
       </w:r>
     </w:p>
     <w:sectPr>

</xml_diff>